<commit_message>
Sesiones 4 y 5: las prácticas migran a Copilot Chat con archivos adjuntos
- Práctica B de la sesión 4 ya no depende de Copilot dentro de Excel: se
  hace en Copilot Chat con los tres documentos adjuntos y la tabla se pega
  en la plantilla. Prácticas A y C indican el flujo de adjuntar en el chat.
- El RAG institucional de la sesión 5 se ancla a OneDrive (comprobado) en
  lugar de SharePoint, con nota para verificar SharePoint por área.
- Handouts 4 y 5 actualizados en los mismos puntos.

Co-Authored-By: Claude Fable 5 <noreply@anthropic.com>
</commit_message>
<xml_diff>
--- a/sesion-05/Handout_Sesion_05.docx
+++ b/sesion-05/Handout_Sesion_05.docx
@@ -1495,7 +1495,7 @@
           <w:sz w:val="21"/>
           <w:szCs w:val="21"/>
         </w:rPr>
-        <w:t xml:space="preserve">•   Organiza una carpeta de SharePoint como base documental de tu tema. Una carpeta por asunto, no una por año.</w:t>
+        <w:t xml:space="preserve">•   Organiza una carpeta de OneDrive como base documental de tu tema. Una carpeta por asunto, no una por año. Si tu área ya trabaja en SharePoint, el mismo método aplica: verifica primero que tu Copilot Chat alcance esa carpeta.</w:t>
       </w:r>
     </w:p>
     <w:p>
@@ -1525,7 +1525,7 @@
           <w:sz w:val="21"/>
           <w:szCs w:val="21"/>
         </w:rPr>
-        <w:t xml:space="preserve">•   Formula la pregunta señalando la carpeta expresamente.</w:t>
+        <w:t xml:space="preserve">•   Formula la pregunta en Copilot Chat referenciando la carpeta o sus archivos expresamente.</w:t>
       </w:r>
     </w:p>
     <w:p>

</xml_diff>

<commit_message>
Sesión 5: adjuntar no es RAG, y el bibliotecario eres tú
El Instituto tiene Copilot Chat sin la licencia de paga Microsoft 365
Copilot, así que no hay índice semántico sobre OneDrive: adjuntar un
archivo equivale a subirlo a la conversación. El bloque de RAG se ajustó
a esa realidad.

- Lámina nueva que distingue la ventana de contexto (el escritorio) del
  RAG (la biblioteca con bibliotecario), con sus fuentes.
- El Tu turno y la lámina de búsqueda por cercanía se reescribieron, con
  notas de ponente; el bloque empieza a las 11:07.
- Anexo visual de nueve láminas para la charla opcional del receso:
  piezas, costos, cómo falla cada camino y fuentes verificadas.
- NotebookLM hoy se llama Gemini Notebook; la cuenta gratuita de You.com
  es una prueba de 25 consultas (aviso al equipo 4).
- Handout y temario alineados, con nota fechada del ajuste.

Co-Authored-By: Claude Fable 5.1 <noreply@anthropic.com>
</commit_message>
<xml_diff>
--- a/sesion-05/Handout_Sesion_05.docx
+++ b/sesion-05/Handout_Sesion_05.docx
@@ -592,7 +592,7 @@
                 <w:sz w:val="19"/>
                 <w:szCs w:val="19"/>
               </w:rPr>
-              <w:t xml:space="preserve">NotebookLM, bloqueada</w:t>
+              <w:t xml:space="preserve">NotebookLM (hoy Gemini Notebook), bloqueada</w:t>
             </w:r>
           </w:p>
         </w:tc>
@@ -1126,7 +1126,7 @@
           <w:sz w:val="21"/>
           <w:szCs w:val="21"/>
         </w:rPr>
-        <w:t xml:space="preserve">Y una advertencia de calendario: si tu equipo usa Elicit, actívala hoy y no antes. Son siete días de prueba y se vencen el 28.</w:t>
+        <w:t xml:space="preserve">Y dos advertencias: si tu equipo usa Elicit, actívala hoy y no antes, porque son siete días de prueba y se vencen el 28. Y si tu equipo usa You.com, su cuenta gratuita es desde abril una prueba de 25 consultas: trabaja en Perplexity y usa You.com solo para contrastar.</w:t>
       </w:r>
     </w:p>
     <w:p>
@@ -1419,7 +1419,7 @@
                 <w:sz w:val="19"/>
                 <w:szCs w:val="19"/>
               </w:rPr>
-              <w:t xml:space="preserve">Responde citando el párrafo exacto de cada documento fuente. Es justo lo que vas a construir a mano mañana en la matriz de evidencia. Está bloqueada en la red del Instituto y vale la pena pedirla: es del mismo proveedor que Gemini, que sí liberaron.</w:t>
+              <w:t xml:space="preserve">Desde julio de 2026 se llama Gemini Notebook. Responde citando el párrafo exacto de cada documento fuente. Es justo lo que vas a construir a mano mañana en la matriz de evidencia. Está bloqueada en la red del Instituto y vale la pena pedirla: es del mismo proveedor que Gemini, que sí liberaron.</w:t>
             </w:r>
           </w:p>
         </w:tc>
@@ -1480,7 +1480,7 @@
           <w:sz w:val="21"/>
           <w:szCs w:val="21"/>
         </w:rPr>
-        <w:t xml:space="preserve">RAG quiere decir que la herramienta busca en tus documentos antes de responder, en lugar de contestar de memoria. Eso es lo que hace NotebookLM, y puedes armar una versión con lo que ya tienes.</w:t>
+        <w:t xml:space="preserve">RAG quiere decir que la herramienta busca en un acervo de documentos antes de responder, en lugar de contestar de memoria. Es lo que hace NotebookLM, y es lo que hicieron esta mañana Perplexity, Elicit y Consensus antes de escribirte una sola línea. Adjuntar un archivo no es lo mismo. Cuando adjuntas, pones los documentos sobre el escritorio y el modelo lee lo que tú pusiste. En un RAG hay una biblioteca con bibliotecario: alguien indexó el acervo y un buscador elige por ti qué fragmentos lee el modelo.</w:t>
       </w:r>
     </w:p>
     <w:p>
@@ -1498,7 +1498,43 @@
           <w:sz w:val="21"/>
           <w:szCs w:val="21"/>
         </w:rPr>
-        <w:t xml:space="preserve">Vale la pena saber cómo busca, porque explica qué tienes que hacer tú. La herramienta parte tus documentos en fragmentos, convierte cada fragmento en coordenadas y, cuando preguntas, recupera los fragmentos que caen más cerca de tu pregunta. Busca por cercanía de significado, no por coincidencia exacta de palabras. De ahí salen las dos reglas de abajo: un nombre de archivo que describe el contenido y una carpeta por asunto le dan más señal para acercarse a lo que necesitas, y un documento gigante y revuelto se lo pone difícil.</w:t>
+        <w:t xml:space="preserve">Vale la pena saber cómo busca ese bibliotecario. Parte los documentos en fragmentos, convierte cada fragmento en coordenadas y, cuando preguntas, recupera los fragmentos que caen más cerca de tu pregunta. Busca sobre todo por cercanía de significado, y los sistemas reales la combinan con coincidencia de palabras. Es la misma idea del viernes, cuando agrupaste los registros de atención ciudadana.</w:t>
+      </w:r>
+    </w:p>
+    <w:p>
+      <w:pPr>
+        <w:spacing w:after="120" w:line="285"/>
+        <w:jc w:val="both"/>
+      </w:pPr>
+      <w:r>
+        <w:rPr>
+          <w:rFonts w:ascii="Arial" w:cs="Arial" w:eastAsia="Arial" w:hAnsi="Arial"/>
+          <w:b w:val="false"/>
+          <w:bCs w:val="false"/>
+          <w:i w:val="false"/>
+          <w:iCs w:val="false"/>
+          <w:sz w:val="21"/>
+          <w:szCs w:val="21"/>
+        </w:rPr>
+        <w:t xml:space="preserve">Las dos maneras fallan calladas, y fallan distinto. Con todo sobre el escritorio, cada pregunta vuelve a procesar todas las páginas, y entre más texto hay en la mesa, peor aprovecha el modelo cada parte, sobre todo lo que queda en medio. Con un buscador, armar el índice cuesta y cada consulta es barata, pero si el fragmento correcto no se recupera, el modelo responde sin él y con el mismo aplomo. Desde fuera no siempre sabes cuál te tocó: ChatGPT, con archivos largos, pasa del escritorio a la biblioteca sin avisarte. Por eso en las dos se pide la cita y se va al párrafo.</w:t>
+      </w:r>
+    </w:p>
+    <w:p>
+      <w:pPr>
+        <w:spacing w:after="120" w:line="285"/>
+        <w:jc w:val="both"/>
+      </w:pPr>
+      <w:r>
+        <w:rPr>
+          <w:rFonts w:ascii="Arial" w:cs="Arial" w:eastAsia="Arial" w:hAnsi="Arial"/>
+          <w:b w:val="false"/>
+          <w:bCs w:val="false"/>
+          <w:i w:val="false"/>
+          <w:iCs w:val="false"/>
+          <w:sz w:val="21"/>
+          <w:szCs w:val="21"/>
+        </w:rPr>
+        <w:t xml:space="preserve">El Copilot Chat del Instituto no trae ese buscador. Microsoft reserva el índice semántico sobre OneDrive y SharePoint a la licencia de paga Microsoft 365 Copilot, la misma que pondría a Copilot dentro de Word y Excel, donde ya vimos que no aparece. Con Copilot Chat, adjuntar o referenciar un archivo de OneDrive equivale a subirlo a la conversación: trabaja con los archivos que tú eliges y con ninguno más. Hoy el bibliotecario eres tú, y estas son las reglas del oficio.</w:t>
       </w:r>
     </w:p>
     <w:p>
@@ -1528,7 +1564,7 @@
           <w:sz w:val="21"/>
           <w:szCs w:val="21"/>
         </w:rPr>
-        <w:t xml:space="preserve">•   Nombra los archivos de manera que el nombre diga qué contiene. Copilot busca por nombre antes que por contenido.</w:t>
+        <w:t xml:space="preserve">•   Nombra los archivos de manera que el nombre diga qué contiene. Ese nombre es tu índice: con él decides qué adjuntar.</w:t>
       </w:r>
     </w:p>
     <w:p>
@@ -1543,7 +1579,7 @@
           <w:sz w:val="21"/>
           <w:szCs w:val="21"/>
         </w:rPr>
-        <w:t xml:space="preserve">•   Formula la pregunta en Copilot Chat referenciando la carpeta o sus archivos expresamente.</w:t>
+        <w:t xml:space="preserve">•   Adjunta en Copilot Chat los archivos que responden tu pregunta y pide la cita del párrafo. Si un documento es muy largo, no des por hecho que lo leyó completo: pregunta por una sección intermedia o pártelo.</w:t>
       </w:r>
     </w:p>
     <w:p>
@@ -1558,7 +1594,7 @@
           <w:sz w:val="21"/>
           <w:szCs w:val="21"/>
         </w:rPr>
-        <w:t xml:space="preserve">•   Compara contra la misma pregunta sin anclar. La diferencia suele ser grande, y es lo que justifica el trabajo de organizar carpetas.</w:t>
+        <w:t xml:space="preserve">•   Compara contra la misma pregunta sin adjuntar nada. La diferencia suele ser grande, y es lo que justifica el trabajo de organizar carpetas.</w:t>
       </w:r>
     </w:p>
     <w:p>
@@ -1582,6 +1618,22 @@
           <w:szCs w:val="21"/>
         </w:rPr>
         <w:t xml:space="preserve">Esto es lo único de hoy que funciona con información amarilla. Todo lo demás que probaste es solo para información pública.</w:t>
+      </w:r>
+    </w:p>
+    <w:p>
+      <w:pPr>
+        <w:spacing w:after="120" w:line="285"/>
+        <w:jc w:val="both"/>
+      </w:pPr>
+      <w:r>
+        <w:rPr>
+          <w:rFonts w:ascii="Arial" w:cs="Arial" w:eastAsia="Arial" w:hAnsi="Arial"/>
+          <w:i w:val="false"/>
+          <w:iCs w:val="false"/>
+          <w:sz w:val="21"/>
+          <w:szCs w:val="21"/>
+        </w:rPr>
+        <w:t xml:space="preserve">Para profundizar está el Anexo_Ventana_de_contexto_y_RAG.pptx, en esta misma carpeta, con las ligas completas. Las fuentes principales: Lewis y otros (2020), «Retrieval-Augmented Generation for Knowledge-Intensive NLP Tasks», arXiv:2005.11401; Liu y otros (2024), «Lost in the Middle: How Language Models Use Long Contexts», arXiv:2307.03172; y Microsoft, «How Copilot Chat works with and without a Microsoft 365 Copilot license», en support.microsoft.com.</w:t>
       </w:r>
     </w:p>
     <w:p>

</xml_diff>

<commit_message>
Sesión 5: las herramientas se van de tarea y RAG queda dentro de la sesión
- La evaluación por equipo de la herramienta asignada pasa a tarea, con
  entrega el martes 22 antes de las 9:00 (renglón del cuadro comparativo
  y cuartilla); la puesta en común se sustituye por el cuadro consolidado.
- El mazo incorpora siete láminas del anexo: los dos caminos, las piezas,
  los dos momentos, la decisión de costos, cómo falla cada camino, dónde
  está el RAG en lo que ya usas y cuatro frases que no se sostienen.
- Dos prácticas en clase: la prueba del dato señuelo (15 min) y la base
  documental propia con una pregunta real y una cita trazada (20 min).
- Agenda, divisores, cierre y notas de ponente con la mecánica de cada
  lámina; handout y temario alineados. El anexo queda como material de
  consulta con las fuentes.

Co-Authored-By: Claude Fable 5.1 <noreply@anthropic.com>
</commit_message>
<xml_diff>
--- a/sesion-05/Handout_Sesion_05.docx
+++ b/sesion-05/Handout_Sesion_05.docx
@@ -64,7 +64,7 @@
           <w:sz w:val="21"/>
           <w:szCs w:val="21"/>
         </w:rPr>
-        <w:t xml:space="preserve">Hoy no empiezas de cero: trabajas sobre el corpus y el libro de códigos que ratificaste el viernes. Esta hoja trae el mapa del ecosistema, el reparto por equipos y qué entregas.</w:t>
+        <w:t xml:space="preserve">La evaluación de herramientas se va de tarea, en equipo, sobre el corpus y el libro de códigos que ratificaste el viernes; el tiempo de clase de hoy es para RAG. Esta hoja trae el mapa del ecosistema, el reparto por equipos, la explicación de RAG con sus dos prácticas y qué entregas.</w:t>
       </w:r>
     </w:p>
     <w:p>
@@ -99,7 +99,7 @@
           <w:sz w:val="27"/>
           <w:szCs w:val="27"/>
         </w:rPr>
-        <w:t xml:space="preserve">1. Las tres preguntas de hoy</w:t>
+        <w:t xml:space="preserve">1. Las tres preguntas de la tarea</w:t>
       </w:r>
     </w:p>
     <w:p>
@@ -117,7 +117,7 @@
           <w:sz w:val="21"/>
           <w:szCs w:val="21"/>
         </w:rPr>
-        <w:t xml:space="preserve">Vienen del contrato del curso. Al cerrar la sesión, las tres quedan respondidas con tu propio trabajo.</w:t>
+        <w:t xml:space="preserve">Vienen del contrato del curso. Las respondes en equipo, de tarea, con tu propio trabajo, y se entregan mañana martes antes de las 9:00.</w:t>
       </w:r>
     </w:p>
     <w:p>
@@ -378,7 +378,7 @@
                 <w:sz w:val="19"/>
                 <w:szCs w:val="19"/>
               </w:rPr>
-              <w:t xml:space="preserve">Todo el curso. Hoy, para codificar.</w:t>
+              <w:t xml:space="preserve">Todo el curso. En la tarea, para codificar.</w:t>
             </w:r>
           </w:p>
         </w:tc>
@@ -458,7 +458,7 @@
                 <w:sz w:val="19"/>
                 <w:szCs w:val="19"/>
               </w:rPr>
-              <w:t xml:space="preserve">Hoy, para sustentar hallazgos con fuentes.</w:t>
+              <w:t xml:space="preserve">En la tarea, para sustentar hallazgos con fuentes.</w:t>
             </w:r>
           </w:p>
         </w:tc>
@@ -538,7 +538,7 @@
                 <w:sz w:val="19"/>
                 <w:szCs w:val="19"/>
               </w:rPr>
-              <w:t xml:space="preserve">Hoy, para buscar literatura de evaluación.</w:t>
+              <w:t xml:space="preserve">En la tarea, para buscar literatura de evaluación.</w:t>
             </w:r>
           </w:p>
         </w:tc>
@@ -1143,7 +1143,7 @@
           <w:sz w:val="27"/>
           <w:szCs w:val="27"/>
         </w:rPr>
-        <w:t xml:space="preserve">4. Tu presentación responde cuatro cosas</w:t>
+        <w:t xml:space="preserve">4. Tu cuartilla responde cuatro cosas</w:t>
       </w:r>
     </w:p>
     <w:p>
@@ -1161,7 +1161,7 @@
           <w:sz w:val="21"/>
           <w:szCs w:val="21"/>
         </w:rPr>
-        <w:t xml:space="preserve">Cinco minutos por equipo. No es una demostración de la herramienta: es un dictamen sobre ella.</w:t>
+        <w:t xml:space="preserve">Una cuartilla por equipo. No es una demostración de la herramienta: es un dictamen sobre ella.</w:t>
       </w:r>
     </w:p>
     <w:p>
@@ -1480,7 +1480,7 @@
           <w:sz w:val="21"/>
           <w:szCs w:val="21"/>
         </w:rPr>
-        <w:t xml:space="preserve">RAG quiere decir que la herramienta busca en un acervo de documentos antes de responder, en lugar de contestar de memoria. Es lo que hace NotebookLM, y es lo que hicieron esta mañana Perplexity, Elicit y Consensus antes de escribirte una sola línea. Adjuntar un archivo no es lo mismo. Cuando adjuntas, pones los documentos sobre el escritorio y el modelo lee lo que tú pusiste. En un RAG hay una biblioteca con bibliotecario: alguien indexó el acervo y un buscador elige por ti qué fragmentos lee el modelo.</w:t>
+        <w:t xml:space="preserve">RAG quiere decir que la herramienta busca en un acervo de documentos antes de responder, en lugar de contestar de memoria. Es lo que hace NotebookLM, y es lo que hacen Perplexity, Elicit y Consensus, que tres equipos se llevan de tarea, antes de escribirte una sola línea. Adjuntar un archivo no es lo mismo. Cuando adjuntas, pones los documentos sobre el escritorio y el modelo lee lo que tú pusiste. En un RAG hay una biblioteca con bibliotecario: alguien indexó el acervo y un buscador elige por ti qué fragmentos lee el modelo.</w:t>
       </w:r>
     </w:p>
     <w:p>
@@ -1609,7 +1609,7 @@
           <w:sz w:val="21"/>
           <w:szCs w:val="21"/>
         </w:rPr>
-        <w:t xml:space="preserve">•   Compara las dos respuestas. La diferencia suele ser grande, y es lo que justifica el trabajo de organizar carpetas.</w:t>
+        <w:t xml:space="preserve">•   Compara las dos respuestas: esa diferencia es la que separa adjuntar de un RAG. Después repite el método con tu material real: una pregunta que de verdad necesites contestar, solo los archivos pertinentes, la cita del párrafo, y trazas una cita hasta el documento.</w:t>
       </w:r>
     </w:p>
     <w:p>
@@ -1792,7 +1792,7 @@
                 <w:sz w:val="19"/>
                 <w:szCs w:val="19"/>
               </w:rPr>
-              <w:t xml:space="preserve">Tu renglón lleno con las columnas de juicio propio. Se consolida con el de los demás equipos al cerrar la sesión.</w:t>
+              <w:t xml:space="preserve">Tu renglón lleno con las columnas de juicio propio. Se entrega mañana martes antes de las 9:00 y se consolida con el de los demás equipos.</w:t>
             </w:r>
           </w:p>
         </w:tc>
@@ -1846,7 +1846,7 @@
                 <w:sz w:val="19"/>
                 <w:szCs w:val="19"/>
               </w:rPr>
-              <w:t xml:space="preserve">Cuál herramienta valdría la pena contratar o solicitar, con costo estimado y para qué tarea. S05_Equipo##_Justificacion.docx.</w:t>
+              <w:t xml:space="preserve">Cuál herramienta valdría la pena contratar o solicitar, con costo estimado y para qué tarea. S05_Equipo##_Justificacion.docx, mañana martes antes de las 9:00.</w:t>
             </w:r>
           </w:p>
         </w:tc>

</xml_diff>